<commit_message>
Fix mistakes in posters
</commit_message>
<xml_diff>
--- a/Documents/Info pages/Ultrasound-info.docx
+++ b/Documents/Info pages/Ultrasound-info.docx
@@ -317,7 +317,7 @@
     </w:p>
     <w:p>
       <w:pPr>
-        <w:spacing w:after="0" w:line="276" w:lineRule="auto"/>
+        <w:spacing w:after="120" w:line="276" w:lineRule="auto"/>
         <w:rPr>
           <w:rFonts w:ascii="Calibri" w:hAnsi="Calibri" w:cs="Calibri"/>
           <w:b/>
@@ -326,82 +326,10 @@
       </w:pPr>
       <w:r>
         <w:rPr>
-          <w:noProof/>
-        </w:rPr>
-        <w:drawing>
-          <wp:inline distT="0" distB="0" distL="0" distR="0" wp14:anchorId="5656C7F6" wp14:editId="249F1624">
-            <wp:extent cx="5731510" cy="2503965"/>
-            <wp:effectExtent l="0" t="0" r="2540" b="0"/>
-            <wp:docPr id="1978754515" name="Picture 1"/>
-            <wp:cNvGraphicFramePr>
-              <a:graphicFrameLocks xmlns:a="http://schemas.openxmlformats.org/drawingml/2006/main" noChangeAspect="1"/>
-            </wp:cNvGraphicFramePr>
-            <a:graphic xmlns:a="http://schemas.openxmlformats.org/drawingml/2006/main">
-              <a:graphicData uri="http://schemas.openxmlformats.org/drawingml/2006/picture">
-                <pic:pic xmlns:pic="http://schemas.openxmlformats.org/drawingml/2006/picture">
-                  <pic:nvPicPr>
-                    <pic:cNvPr id="0" name="Picture 1"/>
-                    <pic:cNvPicPr>
-                      <a:picLocks noChangeAspect="1" noChangeArrowheads="1"/>
-                    </pic:cNvPicPr>
-                  </pic:nvPicPr>
-                  <pic:blipFill>
-                    <a:blip r:embed="rId7">
-                      <a:extLst>
-                        <a:ext uri="{28A0092B-C50C-407E-A947-70E740481C1C}">
-                          <a14:useLocalDpi xmlns:a14="http://schemas.microsoft.com/office/drawing/2010/main" val="0"/>
-                        </a:ext>
-                      </a:extLst>
-                    </a:blip>
-                    <a:srcRect/>
-                    <a:stretch>
-                      <a:fillRect/>
-                    </a:stretch>
-                  </pic:blipFill>
-                  <pic:spPr bwMode="auto">
-                    <a:xfrm>
-                      <a:off x="0" y="0"/>
-                      <a:ext cx="5731510" cy="2503965"/>
-                    </a:xfrm>
-                    <a:prstGeom prst="rect">
-                      <a:avLst/>
-                    </a:prstGeom>
-                    <a:noFill/>
-                    <a:ln>
-                      <a:noFill/>
-                    </a:ln>
-                  </pic:spPr>
-                </pic:pic>
-              </a:graphicData>
-            </a:graphic>
-          </wp:inline>
-        </w:drawing>
-      </w:r>
-      <w:r>
-        <w:rPr>
           <w:rFonts w:ascii="Calibri" w:hAnsi="Calibri" w:cs="Calibri"/>
           <w:b/>
           <w:bCs/>
         </w:rPr>
-        <w:br w:type="page"/>
-      </w:r>
-    </w:p>
-    <w:p>
-      <w:pPr>
-        <w:spacing w:after="120" w:line="276" w:lineRule="auto"/>
-        <w:rPr>
-          <w:rFonts w:ascii="Calibri" w:hAnsi="Calibri" w:cs="Calibri"/>
-          <w:b/>
-          <w:bCs/>
-        </w:rPr>
-      </w:pPr>
-      <w:r>
-        <w:rPr>
-          <w:rFonts w:ascii="Calibri" w:hAnsi="Calibri" w:cs="Calibri"/>
-          <w:b/>
-          <w:bCs/>
-        </w:rPr>
-        <w:lastRenderedPageBreak/>
         <w:t>Why is ultrasound useful?</w:t>
       </w:r>
     </w:p>
@@ -535,7 +463,6 @@
     </w:p>
     <w:p>
       <w:pPr>
-        <w:spacing w:after="120" w:line="276" w:lineRule="auto"/>
         <w:rPr>
           <w:rFonts w:ascii="Calibri" w:hAnsi="Calibri" w:cs="Calibri"/>
           <w:b/>
@@ -548,7 +475,34 @@
           <w:b/>
           <w:bCs/>
         </w:rPr>
-        <w:t>How to set up this demo:</w:t>
+        <w:br w:type="page"/>
+      </w:r>
+    </w:p>
+    <w:p>
+      <w:pPr>
+        <w:spacing w:after="120" w:line="276" w:lineRule="auto"/>
+        <w:rPr>
+          <w:rFonts w:ascii="Calibri" w:hAnsi="Calibri" w:cs="Calibri"/>
+          <w:b/>
+          <w:bCs/>
+        </w:rPr>
+      </w:pPr>
+      <w:r>
+        <w:rPr>
+          <w:rFonts w:ascii="Calibri" w:hAnsi="Calibri" w:cs="Calibri"/>
+          <w:b/>
+          <w:bCs/>
+        </w:rPr>
+        <w:lastRenderedPageBreak/>
+        <w:t>H</w:t>
+      </w:r>
+      <w:r>
+        <w:rPr>
+          <w:rFonts w:ascii="Calibri" w:hAnsi="Calibri" w:cs="Calibri"/>
+          <w:b/>
+          <w:bCs/>
+        </w:rPr>
+        <w:t>ow to set up this demo:</w:t>
       </w:r>
     </w:p>
     <w:p>
@@ -608,7 +562,7 @@
                     </pic:cNvPicPr>
                   </pic:nvPicPr>
                   <pic:blipFill rotWithShape="1">
-                    <a:blip r:embed="rId8" cstate="print">
+                    <a:blip r:embed="rId7" cstate="print">
                       <a:extLst>
                         <a:ext uri="{28A0092B-C50C-407E-A947-70E740481C1C}">
                           <a14:useLocalDpi xmlns:a14="http://schemas.microsoft.com/office/drawing/2010/main" val="0"/>
@@ -702,7 +656,7 @@
                     </pic:cNvPicPr>
                   </pic:nvPicPr>
                   <pic:blipFill>
-                    <a:blip r:embed="rId9" cstate="print">
+                    <a:blip r:embed="rId8" cstate="print">
                       <a:extLst>
                         <a:ext uri="{28A0092B-C50C-407E-A947-70E740481C1C}">
                           <a14:useLocalDpi xmlns:a14="http://schemas.microsoft.com/office/drawing/2010/main" val="0"/>
@@ -736,16 +690,6 @@
     </w:p>
     <w:p>
       <w:pPr>
-        <w:spacing w:after="120" w:line="276" w:lineRule="auto"/>
-        <w:rPr>
-          <w:rFonts w:ascii="Calibri" w:hAnsi="Calibri" w:cs="Calibri"/>
-          <w:b/>
-          <w:bCs/>
-        </w:rPr>
-      </w:pPr>
-    </w:p>
-    <w:p>
-      <w:pPr>
         <w:pStyle w:val="ListParagraph"/>
         <w:numPr>
           <w:ilvl w:val="0"/>
@@ -760,7 +704,6 @@
         <w:rPr>
           <w:rFonts w:ascii="Calibri" w:hAnsi="Calibri" w:cs="Calibri"/>
         </w:rPr>
-        <w:lastRenderedPageBreak/>
         <w:t>Turn on the ultrasound system by pressing the power button (top right of key panel)</w:t>
       </w:r>
       <w:r>
@@ -830,6 +773,7 @@
     <w:p>
       <w:pPr>
         <w:spacing w:after="0" w:line="276" w:lineRule="auto"/>
+        <w:jc w:val="center"/>
         <w:rPr>
           <w:rFonts w:ascii="Calibri" w:hAnsi="Calibri" w:cs="Calibri"/>
         </w:rPr>
@@ -839,10 +783,11 @@
           <w:rFonts w:ascii="Calibri" w:hAnsi="Calibri" w:cs="Calibri"/>
           <w:noProof/>
         </w:rPr>
+        <w:lastRenderedPageBreak/>
         <w:drawing>
-          <wp:inline distT="0" distB="0" distL="0" distR="0" wp14:anchorId="7B691E39" wp14:editId="75695233">
-            <wp:extent cx="4474571" cy="6410325"/>
-            <wp:effectExtent l="0" t="0" r="2540" b="0"/>
+          <wp:inline distT="0" distB="0" distL="0" distR="0" wp14:anchorId="7B691E39" wp14:editId="3EAB1BD5">
+            <wp:extent cx="5704736" cy="8172673"/>
+            <wp:effectExtent l="0" t="0" r="0" b="0"/>
             <wp:docPr id="2124142787" name="Picture 1"/>
             <wp:cNvGraphicFramePr>
               <a:graphicFrameLocks xmlns:a="http://schemas.openxmlformats.org/drawingml/2006/main" noChangeAspect="1"/>
@@ -857,7 +802,7 @@
                     </pic:cNvPicPr>
                   </pic:nvPicPr>
                   <pic:blipFill>
-                    <a:blip r:embed="rId10" cstate="print">
+                    <a:blip r:embed="rId9" cstate="print">
                       <a:extLst>
                         <a:ext uri="{28A0092B-C50C-407E-A947-70E740481C1C}">
                           <a14:useLocalDpi xmlns:a14="http://schemas.microsoft.com/office/drawing/2010/main" val="0"/>
@@ -872,7 +817,7 @@
                   <pic:spPr bwMode="auto">
                     <a:xfrm>
                       <a:off x="0" y="0"/>
-                      <a:ext cx="4482228" cy="6421294"/>
+                      <a:ext cx="5732619" cy="8212618"/>
                     </a:xfrm>
                     <a:prstGeom prst="rect">
                       <a:avLst/>
@@ -897,8 +842,8 @@
       </w:pPr>
     </w:p>
     <w:sectPr>
-      <w:headerReference w:type="default" r:id="rId11"/>
-      <w:footerReference w:type="default" r:id="rId12"/>
+      <w:headerReference w:type="default" r:id="rId10"/>
+      <w:footerReference w:type="default" r:id="rId11"/>
       <w:pgSz w:w="11906" w:h="16838"/>
       <w:pgMar w:top="1440" w:right="1440" w:bottom="1440" w:left="1440" w:header="708" w:footer="708" w:gutter="0"/>
       <w:cols w:space="708"/>

</xml_diff>